<commit_message>
docs: arc42/C4 structure note, STRIDE and OWASP LLM Top 10 tables
Co-Authored-By: Claude Opus 5.5 <noreply@anthropic.com>
Claude-Session: https://claude.ai/code/session_01JDvam517Atc93dpXbZEF5b
</commit_message>
<xml_diff>
--- a/docs/technical-doc/AI-Guardian-TechnicalDocumentation.docx
+++ b/docs/technical-doc/AI-Guardian-TechnicalDocumentation.docx
@@ -688,7 +688,7 @@
               <w:rPr>
                 <w:sz w:val="18"/>
               </w:rPr>
-              <w:t>Signed registry, check 1 and 5, attacks A1, A6, A7, A8</w:t>
+              <w:t>Signed registry, check 1 and 5, attacks A1, A6, A7, A8; STRIDE and OWASP LLM tables</w:t>
             </w:r>
           </w:p>
         </w:tc>
@@ -1323,6 +1323,414 @@
                 <w:sz w:val="18"/>
               </w:rPr>
               <w:t>Indonesian slang and typos understood or clarified</w:t>
+            </w:r>
+          </w:p>
+        </w:tc>
+      </w:tr>
+    </w:tbl>
+    <w:p>
+      <w:pPr>
+        <w:spacing w:after="40"/>
+      </w:pPr>
+    </w:p>
+    <w:p>
+      <w:pPr>
+        <w:pStyle w:val="Heading2"/>
+      </w:pPr>
+      <w:r>
+        <w:t>How this document is organised</w:t>
+      </w:r>
+    </w:p>
+    <w:p>
+      <w:pPr>
+        <w:spacing w:after="80"/>
+      </w:pPr>
+      <w:r>
+        <w:rPr/>
+        <w:t xml:space="preserve">The structure follows </w:t>
+      </w:r>
+      <w:r>
+        <w:rPr>
+          <w:b/>
+        </w:rPr>
+        <w:t>arc42</w:t>
+      </w:r>
+      <w:r>
+        <w:rPr/>
+        <w:t xml:space="preserve"> in a lightweight form, ordered by the judging criteria. The architecture diagram follows the </w:t>
+      </w:r>
+      <w:r>
+        <w:rPr>
+          <w:b/>
+        </w:rPr>
+        <w:t>C4 model</w:t>
+      </w:r>
+      <w:r>
+        <w:rPr/>
+        <w:t xml:space="preserve"> at container level. Security uses </w:t>
+      </w:r>
+      <w:r>
+        <w:rPr>
+          <w:b/>
+        </w:rPr>
+        <w:t>STRIDE</w:t>
+      </w:r>
+      <w:r>
+        <w:rPr/>
+        <w:t xml:space="preserve"> and the </w:t>
+      </w:r>
+      <w:r>
+        <w:rPr>
+          <w:b/>
+        </w:rPr>
+        <w:t>OWASP Top 10 for LLM Applications (2025)</w:t>
+      </w:r>
+      <w:r>
+        <w:rPr/>
+        <w:t>.</w:t>
+      </w:r>
+    </w:p>
+    <w:tbl>
+      <w:tblPr>
+        <w:tblW w:type="dxa" w:w="9639"/>
+        <w:jc w:val="center"/>
+        <w:tblLayout w:type="fixed"/>
+        <w:tblLook w:firstColumn="1" w:firstRow="1" w:lastColumn="0" w:lastRow="0" w:noHBand="0" w:noVBand="1" w:val="04A0"/>
+        <w:tblBorders>
+          <w:top w:val="single" w:sz="4" w:color="C9D5DC"/>
+          <w:left w:val="single" w:sz="4" w:color="C9D5DC"/>
+          <w:bottom w:val="single" w:sz="4" w:color="C9D5DC"/>
+          <w:right w:val="single" w:sz="4" w:color="C9D5DC"/>
+          <w:insideH w:val="single" w:sz="4" w:color="C9D5DC"/>
+          <w:insideV w:val="single" w:sz="4" w:color="C9D5DC"/>
+        </w:tblBorders>
+        <w:tblLayout w:type="fixed"/>
+      </w:tblPr>
+      <w:tblGrid>
+        <w:gridCol w:w="4819"/>
+        <w:gridCol w:w="4819"/>
+      </w:tblGrid>
+      <w:tr>
+        <w:trPr>
+          <w:cantSplit/>
+          <w:tblHeader w:val="true"/>
+        </w:trPr>
+        <w:tc>
+          <w:tcPr>
+            <w:tcW w:type="dxa" w:w="4819"/>
+            <w:shd w:val="clear" w:color="auto" w:fill="DAE7EE"/>
+          </w:tcPr>
+          <w:p>
+            <w:pPr>
+              <w:spacing w:after="20" w:before="20"/>
+            </w:pPr>
+            <w:r/>
+            <w:r>
+              <w:rPr>
+                <w:b/>
+                <w:color w:val="375D84"/>
+                <w:sz w:val="18"/>
+              </w:rPr>
+              <w:t>arc42 section</w:t>
+            </w:r>
+          </w:p>
+        </w:tc>
+        <w:tc>
+          <w:tcPr>
+            <w:tcW w:type="dxa" w:w="4819"/>
+            <w:shd w:val="clear" w:color="auto" w:fill="DAE7EE"/>
+          </w:tcPr>
+          <w:p>
+            <w:pPr>
+              <w:spacing w:after="20" w:before="20"/>
+            </w:pPr>
+            <w:r/>
+            <w:r>
+              <w:rPr>
+                <w:b/>
+                <w:color w:val="375D84"/>
+                <w:sz w:val="18"/>
+              </w:rPr>
+              <w:t>Here</w:t>
+            </w:r>
+          </w:p>
+        </w:tc>
+      </w:tr>
+      <w:tr>
+        <w:trPr>
+          <w:cantSplit/>
+        </w:trPr>
+        <w:tc>
+          <w:tcPr>
+            <w:tcW w:type="dxa" w:w="4819"/>
+          </w:tcPr>
+          <w:p>
+            <w:pPr>
+              <w:spacing w:after="20" w:before="20"/>
+            </w:pPr>
+            <w:r/>
+            <w:r>
+              <w:rPr>
+                <w:sz w:val="18"/>
+              </w:rPr>
+              <w:t>1 Introduction and goals · 3 Context and scope</w:t>
+            </w:r>
+          </w:p>
+        </w:tc>
+        <w:tc>
+          <w:tcPr>
+            <w:tcW w:type="dxa" w:w="4819"/>
+          </w:tcPr>
+          <w:p>
+            <w:pPr>
+              <w:spacing w:after="20" w:before="20"/>
+            </w:pPr>
+            <w:r/>
+            <w:r>
+              <w:rPr>
+                <w:sz w:val="18"/>
+              </w:rPr>
+              <w:t>§1 Summary, §2 Problem, §3 Scenario</w:t>
+            </w:r>
+          </w:p>
+        </w:tc>
+      </w:tr>
+      <w:tr>
+        <w:trPr>
+          <w:cantSplit/>
+        </w:trPr>
+        <w:tc>
+          <w:tcPr>
+            <w:tcW w:type="dxa" w:w="4819"/>
+            <w:shd w:val="clear" w:color="auto" w:fill="F3F7F9"/>
+          </w:tcPr>
+          <w:p>
+            <w:pPr>
+              <w:spacing w:after="20" w:before="20"/>
+            </w:pPr>
+            <w:r/>
+            <w:r>
+              <w:rPr>
+                <w:sz w:val="18"/>
+              </w:rPr>
+              <w:t>4 Solution strategy · 5 Building blocks</w:t>
+            </w:r>
+          </w:p>
+        </w:tc>
+        <w:tc>
+          <w:tcPr>
+            <w:tcW w:type="dxa" w:w="4819"/>
+            <w:shd w:val="clear" w:color="auto" w:fill="F3F7F9"/>
+          </w:tcPr>
+          <w:p>
+            <w:pPr>
+              <w:spacing w:after="20" w:before="20"/>
+            </w:pPr>
+            <w:r/>
+            <w:r>
+              <w:rPr>
+                <w:sz w:val="18"/>
+              </w:rPr>
+              <w:t>§5 Architecture and agent design</w:t>
+            </w:r>
+          </w:p>
+        </w:tc>
+      </w:tr>
+      <w:tr>
+        <w:trPr>
+          <w:cantSplit/>
+        </w:trPr>
+        <w:tc>
+          <w:tcPr>
+            <w:tcW w:type="dxa" w:w="4819"/>
+          </w:tcPr>
+          <w:p>
+            <w:pPr>
+              <w:spacing w:after="20" w:before="20"/>
+            </w:pPr>
+            <w:r/>
+            <w:r>
+              <w:rPr>
+                <w:sz w:val="18"/>
+              </w:rPr>
+              <w:t>6 Runtime view</w:t>
+            </w:r>
+          </w:p>
+        </w:tc>
+        <w:tc>
+          <w:tcPr>
+            <w:tcW w:type="dxa" w:w="4819"/>
+          </w:tcPr>
+          <w:p>
+            <w:pPr>
+              <w:spacing w:after="20" w:before="20"/>
+            </w:pPr>
+            <w:r/>
+            <w:r>
+              <w:rPr>
+                <w:sz w:val="18"/>
+              </w:rPr>
+              <w:t>§5 Payment trace, §6 Intent, §7 Turns</w:t>
+            </w:r>
+          </w:p>
+        </w:tc>
+      </w:tr>
+      <w:tr>
+        <w:trPr>
+          <w:cantSplit/>
+        </w:trPr>
+        <w:tc>
+          <w:tcPr>
+            <w:tcW w:type="dxa" w:w="4819"/>
+            <w:shd w:val="clear" w:color="auto" w:fill="F3F7F9"/>
+          </w:tcPr>
+          <w:p>
+            <w:pPr>
+              <w:spacing w:after="20" w:before="20"/>
+            </w:pPr>
+            <w:r/>
+            <w:r>
+              <w:rPr>
+                <w:sz w:val="18"/>
+              </w:rPr>
+              <w:t>7 Deployment view</w:t>
+            </w:r>
+          </w:p>
+        </w:tc>
+        <w:tc>
+          <w:tcPr>
+            <w:tcW w:type="dxa" w:w="4819"/>
+            <w:shd w:val="clear" w:color="auto" w:fill="F3F7F9"/>
+          </w:tcPr>
+          <w:p>
+            <w:pPr>
+              <w:spacing w:after="20" w:before="20"/>
+            </w:pPr>
+            <w:r/>
+            <w:r>
+              <w:rPr>
+                <w:sz w:val="18"/>
+              </w:rPr>
+              <w:t>§16 Deployment</w:t>
+            </w:r>
+          </w:p>
+        </w:tc>
+      </w:tr>
+      <w:tr>
+        <w:trPr>
+          <w:cantSplit/>
+        </w:trPr>
+        <w:tc>
+          <w:tcPr>
+            <w:tcW w:type="dxa" w:w="4819"/>
+          </w:tcPr>
+          <w:p>
+            <w:pPr>
+              <w:spacing w:after="20" w:before="20"/>
+            </w:pPr>
+            <w:r/>
+            <w:r>
+              <w:rPr>
+                <w:sz w:val="18"/>
+              </w:rPr>
+              <w:t>8 Cross-cutting concepts</w:t>
+            </w:r>
+          </w:p>
+        </w:tc>
+        <w:tc>
+          <w:tcPr>
+            <w:tcW w:type="dxa" w:w="4819"/>
+          </w:tcPr>
+          <w:p>
+            <w:pPr>
+              <w:spacing w:after="20" w:before="20"/>
+            </w:pPr>
+            <w:r/>
+            <w:r>
+              <w:rPr>
+                <w:sz w:val="18"/>
+              </w:rPr>
+              <w:t>§8–§11 Security, permissions, data, user control</w:t>
+            </w:r>
+          </w:p>
+        </w:tc>
+      </w:tr>
+      <w:tr>
+        <w:trPr>
+          <w:cantSplit/>
+        </w:trPr>
+        <w:tc>
+          <w:tcPr>
+            <w:tcW w:type="dxa" w:w="4819"/>
+            <w:shd w:val="clear" w:color="auto" w:fill="F3F7F9"/>
+          </w:tcPr>
+          <w:p>
+            <w:pPr>
+              <w:spacing w:after="20" w:before="20"/>
+            </w:pPr>
+            <w:r/>
+            <w:r>
+              <w:rPr>
+                <w:sz w:val="18"/>
+              </w:rPr>
+              <w:t>10 Quality requirements</w:t>
+            </w:r>
+          </w:p>
+        </w:tc>
+        <w:tc>
+          <w:tcPr>
+            <w:tcW w:type="dxa" w:w="4819"/>
+            <w:shd w:val="clear" w:color="auto" w:fill="F3F7F9"/>
+          </w:tcPr>
+          <w:p>
+            <w:pPr>
+              <w:spacing w:after="20" w:before="20"/>
+            </w:pPr>
+            <w:r/>
+            <w:r>
+              <w:rPr>
+                <w:sz w:val="18"/>
+              </w:rPr>
+              <w:t>§12–§15, §17 Testing and evidence</w:t>
+            </w:r>
+          </w:p>
+        </w:tc>
+      </w:tr>
+      <w:tr>
+        <w:trPr>
+          <w:cantSplit/>
+        </w:trPr>
+        <w:tc>
+          <w:tcPr>
+            <w:tcW w:type="dxa" w:w="4819"/>
+          </w:tcPr>
+          <w:p>
+            <w:pPr>
+              <w:spacing w:after="20" w:before="20"/>
+            </w:pPr>
+            <w:r/>
+            <w:r>
+              <w:rPr>
+                <w:sz w:val="18"/>
+              </w:rPr>
+              <w:t>11 Risks and technical debt</w:t>
+            </w:r>
+          </w:p>
+        </w:tc>
+        <w:tc>
+          <w:tcPr>
+            <w:tcW w:type="dxa" w:w="4819"/>
+          </w:tcPr>
+          <w:p>
+            <w:pPr>
+              <w:spacing w:after="20" w:before="20"/>
+            </w:pPr>
+            <w:r/>
+            <w:r>
+              <w:rPr>
+                <w:sz w:val="18"/>
+              </w:rPr>
+              <w:t>§18 Known risks</w:t>
             </w:r>
           </w:p>
         </w:tc>
@@ -1358,8 +1766,9 @@
         <w:tblLayout w:type="fixed"/>
       </w:tblPr>
       <w:tblGrid>
-        <w:gridCol w:w="4819"/>
-        <w:gridCol w:w="4819"/>
+        <w:gridCol w:w="3288"/>
+        <w:gridCol w:w="3288"/>
+        <w:gridCol w:w="3061"/>
       </w:tblGrid>
       <w:tr>
         <w:trPr>
@@ -1367,16 +1776,16 @@
         </w:trPr>
         <w:tc>
           <w:tcPr>
-            <w:tcW w:type="dxa" w:w="4819"/>
-          </w:tcPr>
-          <w:p>
-            <w:pPr>
-              <w:spacing w:after="20" w:before="20"/>
-            </w:pPr>
-            <w:r/>
-            <w:r>
-              <w:rPr>
-                <w:sz w:val="19"/>
+            <w:tcW w:type="dxa" w:w="3288"/>
+          </w:tcPr>
+          <w:p>
+            <w:pPr>
+              <w:spacing w:after="20" w:before="20"/>
+            </w:pPr>
+            <w:r/>
+            <w:r>
+              <w:rPr>
+                <w:sz w:val="18"/>
               </w:rPr>
               <w:t>1  Summary</w:t>
             </w:r>
@@ -1384,18 +1793,35 @@
         </w:tc>
         <w:tc>
           <w:tcPr>
-            <w:tcW w:type="dxa" w:w="4819"/>
-          </w:tcPr>
-          <w:p>
-            <w:pPr>
-              <w:spacing w:after="20" w:before="20"/>
-            </w:pPr>
-            <w:r/>
-            <w:r>
-              <w:rPr>
-                <w:sz w:val="19"/>
-              </w:rPr>
-              <w:t>10  Data protection</w:t>
+            <w:tcW w:type="dxa" w:w="3288"/>
+          </w:tcPr>
+          <w:p>
+            <w:pPr>
+              <w:spacing w:after="20" w:before="20"/>
+            </w:pPr>
+            <w:r/>
+            <w:r>
+              <w:rPr>
+                <w:sz w:val="18"/>
+              </w:rPr>
+              <w:t>7  Dialogue efficiency, correction and fallback</w:t>
+            </w:r>
+          </w:p>
+        </w:tc>
+        <w:tc>
+          <w:tcPr>
+            <w:tcW w:type="dxa" w:w="3061"/>
+          </w:tcPr>
+          <w:p>
+            <w:pPr>
+              <w:spacing w:after="20" w:before="20"/>
+            </w:pPr>
+            <w:r/>
+            <w:r>
+              <w:rPr>
+                <w:sz w:val="18"/>
+              </w:rPr>
+              <w:t>13  Execution evidence</w:t>
             </w:r>
           </w:p>
         </w:tc>
@@ -1406,7 +1832,7 @@
         </w:trPr>
         <w:tc>
           <w:tcPr>
-            <w:tcW w:type="dxa" w:w="4819"/>
+            <w:tcW w:type="dxa" w:w="3288"/>
             <w:shd w:val="clear" w:color="auto" w:fill="F3F7F9"/>
           </w:tcPr>
           <w:p>
@@ -1416,7 +1842,7 @@
             <w:r/>
             <w:r>
               <w:rPr>
-                <w:sz w:val="19"/>
+                <w:sz w:val="18"/>
               </w:rPr>
               <w:t>2  Problem</w:t>
             </w:r>
@@ -1424,7 +1850,7 @@
         </w:tc>
         <w:tc>
           <w:tcPr>
-            <w:tcW w:type="dxa" w:w="4819"/>
+            <w:tcW w:type="dxa" w:w="3288"/>
             <w:shd w:val="clear" w:color="auto" w:fill="F3F7F9"/>
           </w:tcPr>
           <w:p>
@@ -1434,9 +1860,27 @@
             <w:r/>
             <w:r>
               <w:rPr>
-                <w:sz w:val="19"/>
-              </w:rPr>
-              <w:t>11  User control and risk warnings</w:t>
+                <w:sz w:val="18"/>
+              </w:rPr>
+              <w:t>8  Security design</w:t>
+            </w:r>
+          </w:p>
+        </w:tc>
+        <w:tc>
+          <w:tcPr>
+            <w:tcW w:type="dxa" w:w="3061"/>
+            <w:shd w:val="clear" w:color="auto" w:fill="F3F7F9"/>
+          </w:tcPr>
+          <w:p>
+            <w:pPr>
+              <w:spacing w:after="20" w:before="20"/>
+            </w:pPr>
+            <w:r/>
+            <w:r>
+              <w:rPr>
+                <w:sz w:val="18"/>
+              </w:rPr>
+              <w:t>14  How judges can verify</w:t>
             </w:r>
           </w:p>
         </w:tc>
@@ -1447,16 +1891,16 @@
         </w:trPr>
         <w:tc>
           <w:tcPr>
-            <w:tcW w:type="dxa" w:w="4819"/>
-          </w:tcPr>
-          <w:p>
-            <w:pPr>
-              <w:spacing w:after="20" w:before="20"/>
-            </w:pPr>
-            <w:r/>
-            <w:r>
-              <w:rPr>
-                <w:sz w:val="19"/>
+            <w:tcW w:type="dxa" w:w="3288"/>
+          </w:tcPr>
+          <w:p>
+            <w:pPr>
+              <w:spacing w:after="20" w:before="20"/>
+            </w:pPr>
+            <w:r/>
+            <w:r>
+              <w:rPr>
+                <w:sz w:val="18"/>
               </w:rPr>
               <w:t>3  What is new in this scenario</w:t>
             </w:r>
@@ -1464,18 +1908,35 @@
         </w:tc>
         <w:tc>
           <w:tcPr>
-            <w:tcW w:type="dxa" w:w="4819"/>
-          </w:tcPr>
-          <w:p>
-            <w:pPr>
-              <w:spacing w:after="20" w:before="20"/>
-            </w:pPr>
-            <w:r/>
-            <w:r>
-              <w:rPr>
-                <w:sz w:val="19"/>
-              </w:rPr>
-              <w:t>12  Security testing</w:t>
+            <w:tcW w:type="dxa" w:w="3288"/>
+          </w:tcPr>
+          <w:p>
+            <w:pPr>
+              <w:spacing w:after="20" w:before="20"/>
+            </w:pPr>
+            <w:r/>
+            <w:r>
+              <w:rPr>
+                <w:sz w:val="18"/>
+              </w:rPr>
+              <w:t>9  Permission boundaries</w:t>
+            </w:r>
+          </w:p>
+        </w:tc>
+        <w:tc>
+          <w:tcPr>
+            <w:tcW w:type="dxa" w:w="3061"/>
+          </w:tcPr>
+          <w:p>
+            <w:pPr>
+              <w:spacing w:after="20" w:before="20"/>
+            </w:pPr>
+            <w:r/>
+            <w:r>
+              <w:rPr>
+                <w:sz w:val="18"/>
+              </w:rPr>
+              <w:t>15  Measured value</w:t>
             </w:r>
           </w:p>
         </w:tc>
@@ -1486,7 +1947,7 @@
         </w:trPr>
         <w:tc>
           <w:tcPr>
-            <w:tcW w:type="dxa" w:w="4819"/>
+            <w:tcW w:type="dxa" w:w="3288"/>
             <w:shd w:val="clear" w:color="auto" w:fill="F3F7F9"/>
           </w:tcPr>
           <w:p>
@@ -1496,7 +1957,7 @@
             <w:r/>
             <w:r>
               <w:rPr>
-                <w:sz w:val="19"/>
+                <w:sz w:val="18"/>
               </w:rPr>
               <w:t>4  Product walkthrough</w:t>
             </w:r>
@@ -1504,7 +1965,7 @@
         </w:tc>
         <w:tc>
           <w:tcPr>
-            <w:tcW w:type="dxa" w:w="4819"/>
+            <w:tcW w:type="dxa" w:w="3288"/>
             <w:shd w:val="clear" w:color="auto" w:fill="F3F7F9"/>
           </w:tcPr>
           <w:p>
@@ -1514,9 +1975,27 @@
             <w:r/>
             <w:r>
               <w:rPr>
-                <w:sz w:val="19"/>
-              </w:rPr>
-              <w:t>13  Execution evidence</w:t>
+                <w:sz w:val="18"/>
+              </w:rPr>
+              <w:t>10  Data protection</w:t>
+            </w:r>
+          </w:p>
+        </w:tc>
+        <w:tc>
+          <w:tcPr>
+            <w:tcW w:type="dxa" w:w="3061"/>
+            <w:shd w:val="clear" w:color="auto" w:fill="F3F7F9"/>
+          </w:tcPr>
+          <w:p>
+            <w:pPr>
+              <w:spacing w:after="20" w:before="20"/>
+            </w:pPr>
+            <w:r/>
+            <w:r>
+              <w:rPr>
+                <w:sz w:val="18"/>
+              </w:rPr>
+              <w:t>16  Deployment</w:t>
             </w:r>
           </w:p>
         </w:tc>
@@ -1527,16 +2006,16 @@
         </w:trPr>
         <w:tc>
           <w:tcPr>
-            <w:tcW w:type="dxa" w:w="4819"/>
-          </w:tcPr>
-          <w:p>
-            <w:pPr>
-              <w:spacing w:after="20" w:before="20"/>
-            </w:pPr>
-            <w:r/>
-            <w:r>
-              <w:rPr>
-                <w:sz w:val="19"/>
+            <w:tcW w:type="dxa" w:w="3288"/>
+          </w:tcPr>
+          <w:p>
+            <w:pPr>
+              <w:spacing w:after="20" w:before="20"/>
+            </w:pPr>
+            <w:r/>
+            <w:r>
+              <w:rPr>
+                <w:sz w:val="18"/>
               </w:rPr>
               <w:t>5  Architecture and agent design</w:t>
             </w:r>
@@ -1544,18 +2023,35 @@
         </w:tc>
         <w:tc>
           <w:tcPr>
-            <w:tcW w:type="dxa" w:w="4819"/>
-          </w:tcPr>
-          <w:p>
-            <w:pPr>
-              <w:spacing w:after="20" w:before="20"/>
-            </w:pPr>
-            <w:r/>
-            <w:r>
-              <w:rPr>
-                <w:sz w:val="19"/>
-              </w:rPr>
-              <w:t>14  How judges can verify</w:t>
+            <w:tcW w:type="dxa" w:w="3288"/>
+          </w:tcPr>
+          <w:p>
+            <w:pPr>
+              <w:spacing w:after="20" w:before="20"/>
+            </w:pPr>
+            <w:r/>
+            <w:r>
+              <w:rPr>
+                <w:sz w:val="18"/>
+              </w:rPr>
+              <w:t>11  User control and risk warnings</w:t>
+            </w:r>
+          </w:p>
+        </w:tc>
+        <w:tc>
+          <w:tcPr>
+            <w:tcW w:type="dxa" w:w="3061"/>
+          </w:tcPr>
+          <w:p>
+            <w:pPr>
+              <w:spacing w:after="20" w:before="20"/>
+            </w:pPr>
+            <w:r/>
+            <w:r>
+              <w:rPr>
+                <w:sz w:val="18"/>
+              </w:rPr>
+              <w:t>17  Testing</w:t>
             </w:r>
           </w:p>
         </w:tc>
@@ -1566,7 +2062,7 @@
         </w:trPr>
         <w:tc>
           <w:tcPr>
-            <w:tcW w:type="dxa" w:w="4819"/>
+            <w:tcW w:type="dxa" w:w="3288"/>
             <w:shd w:val="clear" w:color="auto" w:fill="F3F7F9"/>
           </w:tcPr>
           <w:p>
@@ -1576,7 +2072,7 @@
             <w:r/>
             <w:r>
               <w:rPr>
-                <w:sz w:val="19"/>
+                <w:sz w:val="18"/>
               </w:rPr>
               <w:t>6  Intent understanding and clarification</w:t>
             </w:r>
@@ -1584,7 +2080,7 @@
         </w:tc>
         <w:tc>
           <w:tcPr>
-            <w:tcW w:type="dxa" w:w="4819"/>
+            <w:tcW w:type="dxa" w:w="3288"/>
             <w:shd w:val="clear" w:color="auto" w:fill="F3F7F9"/>
           </w:tcPr>
           <w:p>
@@ -1594,59 +2090,15 @@
             <w:r/>
             <w:r>
               <w:rPr>
-                <w:sz w:val="19"/>
-              </w:rPr>
-              <w:t>15  Measured value</w:t>
-            </w:r>
-          </w:p>
-        </w:tc>
-      </w:tr>
-      <w:tr>
-        <w:trPr>
-          <w:cantSplit/>
-        </w:trPr>
-        <w:tc>
-          <w:tcPr>
-            <w:tcW w:type="dxa" w:w="4819"/>
-          </w:tcPr>
-          <w:p>
-            <w:pPr>
-              <w:spacing w:after="20" w:before="20"/>
-            </w:pPr>
-            <w:r/>
-            <w:r>
-              <w:rPr>
-                <w:sz w:val="19"/>
-              </w:rPr>
-              <w:t>7  Dialogue efficiency, correction and fallback</w:t>
-            </w:r>
-          </w:p>
-        </w:tc>
-        <w:tc>
-          <w:tcPr>
-            <w:tcW w:type="dxa" w:w="4819"/>
-          </w:tcPr>
-          <w:p>
-            <w:pPr>
-              <w:spacing w:after="20" w:before="20"/>
-            </w:pPr>
-            <w:r/>
-            <w:r>
-              <w:rPr>
-                <w:sz w:val="19"/>
-              </w:rPr>
-              <w:t>16  Deployment</w:t>
-            </w:r>
-          </w:p>
-        </w:tc>
-      </w:tr>
-      <w:tr>
-        <w:trPr>
-          <w:cantSplit/>
-        </w:trPr>
-        <w:tc>
-          <w:tcPr>
-            <w:tcW w:type="dxa" w:w="4819"/>
+                <w:sz w:val="18"/>
+              </w:rPr>
+              <w:t>12  Security testing</w:t>
+            </w:r>
+          </w:p>
+        </w:tc>
+        <w:tc>
+          <w:tcPr>
+            <w:tcW w:type="dxa" w:w="3061"/>
             <w:shd w:val="clear" w:color="auto" w:fill="F3F7F9"/>
           </w:tcPr>
           <w:p>
@@ -1656,64 +2108,7 @@
             <w:r/>
             <w:r>
               <w:rPr>
-                <w:sz w:val="19"/>
-              </w:rPr>
-              <w:t>8  Security design</w:t>
-            </w:r>
-          </w:p>
-        </w:tc>
-        <w:tc>
-          <w:tcPr>
-            <w:tcW w:type="dxa" w:w="4819"/>
-            <w:shd w:val="clear" w:color="auto" w:fill="F3F7F9"/>
-          </w:tcPr>
-          <w:p>
-            <w:pPr>
-              <w:spacing w:after="20" w:before="20"/>
-            </w:pPr>
-            <w:r/>
-            <w:r>
-              <w:rPr>
-                <w:sz w:val="19"/>
-              </w:rPr>
-              <w:t>17  Testing</w:t>
-            </w:r>
-          </w:p>
-        </w:tc>
-      </w:tr>
-      <w:tr>
-        <w:trPr>
-          <w:cantSplit/>
-        </w:trPr>
-        <w:tc>
-          <w:tcPr>
-            <w:tcW w:type="dxa" w:w="4819"/>
-          </w:tcPr>
-          <w:p>
-            <w:pPr>
-              <w:spacing w:after="20" w:before="20"/>
-            </w:pPr>
-            <w:r/>
-            <w:r>
-              <w:rPr>
-                <w:sz w:val="19"/>
-              </w:rPr>
-              <w:t>9  Permission boundaries</w:t>
-            </w:r>
-          </w:p>
-        </w:tc>
-        <w:tc>
-          <w:tcPr>
-            <w:tcW w:type="dxa" w:w="4819"/>
-          </w:tcPr>
-          <w:p>
-            <w:pPr>
-              <w:spacing w:after="20" w:before="20"/>
-            </w:pPr>
-            <w:r/>
-            <w:r>
-              <w:rPr>
-                <w:sz w:val="19"/>
+                <w:sz w:val="18"/>
               </w:rPr>
               <w:t>18  Known risks and limits</w:t>
             </w:r>
@@ -1725,11 +2120,6 @@
       <w:pPr>
         <w:spacing w:after="40"/>
       </w:pPr>
-    </w:p>
-    <w:p>
-      <w:r>
-        <w:br w:type="page"/>
-      </w:r>
     </w:p>
     <w:p>
       <w:pPr>
@@ -9211,6 +9601,1254 @@
         </w:rPr>
         <w:t>The owner tries to pay while a warning is open: blocked at check 5.</w:t>
       </w:r>
+    </w:p>
+    <w:p>
+      <w:pPr>
+        <w:pStyle w:val="Heading2"/>
+      </w:pPr>
+      <w:r>
+        <w:t>Threat model (STRIDE)</w:t>
+      </w:r>
+    </w:p>
+    <w:tbl>
+      <w:tblPr>
+        <w:tblW w:type="dxa" w:w="9639"/>
+        <w:jc w:val="center"/>
+        <w:tblLayout w:type="fixed"/>
+        <w:tblLook w:firstColumn="1" w:firstRow="1" w:lastColumn="0" w:lastRow="0" w:noHBand="0" w:noVBand="1" w:val="04A0"/>
+        <w:tblBorders>
+          <w:top w:val="single" w:sz="4" w:color="C9D5DC"/>
+          <w:left w:val="single" w:sz="4" w:color="C9D5DC"/>
+          <w:bottom w:val="single" w:sz="4" w:color="C9D5DC"/>
+          <w:right w:val="single" w:sz="4" w:color="C9D5DC"/>
+          <w:insideH w:val="single" w:sz="4" w:color="C9D5DC"/>
+          <w:insideV w:val="single" w:sz="4" w:color="C9D5DC"/>
+        </w:tblBorders>
+        <w:tblLayout w:type="fixed"/>
+      </w:tblPr>
+      <w:tblGrid>
+        <w:gridCol w:w="1587"/>
+        <w:gridCol w:w="2608"/>
+        <w:gridCol w:w="3402"/>
+        <w:gridCol w:w="2041"/>
+      </w:tblGrid>
+      <w:tr>
+        <w:trPr>
+          <w:cantSplit/>
+          <w:tblHeader w:val="true"/>
+        </w:trPr>
+        <w:tc>
+          <w:tcPr>
+            <w:tcW w:type="dxa" w:w="1587"/>
+            <w:shd w:val="clear" w:color="auto" w:fill="DAE7EE"/>
+          </w:tcPr>
+          <w:p>
+            <w:pPr>
+              <w:spacing w:after="20" w:before="20"/>
+            </w:pPr>
+            <w:r/>
+            <w:r>
+              <w:rPr>
+                <w:b/>
+                <w:color w:val="375D84"/>
+                <w:sz w:val="17"/>
+              </w:rPr>
+              <w:t>Threat</w:t>
+            </w:r>
+          </w:p>
+        </w:tc>
+        <w:tc>
+          <w:tcPr>
+            <w:tcW w:type="dxa" w:w="2608"/>
+            <w:shd w:val="clear" w:color="auto" w:fill="DAE7EE"/>
+          </w:tcPr>
+          <w:p>
+            <w:pPr>
+              <w:spacing w:after="20" w:before="20"/>
+            </w:pPr>
+            <w:r/>
+            <w:r>
+              <w:rPr>
+                <w:b/>
+                <w:color w:val="375D84"/>
+                <w:sz w:val="17"/>
+              </w:rPr>
+              <w:t>Example in this product</w:t>
+            </w:r>
+          </w:p>
+        </w:tc>
+        <w:tc>
+          <w:tcPr>
+            <w:tcW w:type="dxa" w:w="3402"/>
+            <w:shd w:val="clear" w:color="auto" w:fill="DAE7EE"/>
+          </w:tcPr>
+          <w:p>
+            <w:pPr>
+              <w:spacing w:after="20" w:before="20"/>
+            </w:pPr>
+            <w:r/>
+            <w:r>
+              <w:rPr>
+                <w:b/>
+                <w:color w:val="375D84"/>
+                <w:sz w:val="17"/>
+              </w:rPr>
+              <w:t>Defence</w:t>
+            </w:r>
+          </w:p>
+        </w:tc>
+        <w:tc>
+          <w:tcPr>
+            <w:tcW w:type="dxa" w:w="2041"/>
+            <w:shd w:val="clear" w:color="auto" w:fill="DAE7EE"/>
+          </w:tcPr>
+          <w:p>
+            <w:pPr>
+              <w:spacing w:after="20" w:before="20"/>
+            </w:pPr>
+            <w:r/>
+            <w:r>
+              <w:rPr>
+                <w:b/>
+                <w:color w:val="375D84"/>
+                <w:sz w:val="17"/>
+              </w:rPr>
+              <w:t>Tested by</w:t>
+            </w:r>
+          </w:p>
+        </w:tc>
+      </w:tr>
+      <w:tr>
+        <w:trPr>
+          <w:cantSplit/>
+        </w:trPr>
+        <w:tc>
+          <w:tcPr>
+            <w:tcW w:type="dxa" w:w="1587"/>
+          </w:tcPr>
+          <w:p>
+            <w:pPr>
+              <w:spacing w:after="20" w:before="20"/>
+            </w:pPr>
+            <w:r/>
+            <w:r>
+              <w:rPr>
+                <w:sz w:val="17"/>
+              </w:rPr>
+              <w:t>Spoofing</w:t>
+            </w:r>
+          </w:p>
+        </w:tc>
+        <w:tc>
+          <w:tcPr>
+            <w:tcW w:type="dxa" w:w="2608"/>
+          </w:tcPr>
+          <w:p>
+            <w:pPr>
+              <w:spacing w:after="20" w:before="20"/>
+            </w:pPr>
+            <w:r/>
+            <w:r>
+              <w:rPr>
+                <w:sz w:val="17"/>
+              </w:rPr>
+              <w:t>Fake hospital staff, “new account” message, someone acting as another member</w:t>
+            </w:r>
+          </w:p>
+        </w:tc>
+        <w:tc>
+          <w:tcPr>
+            <w:tcW w:type="dxa" w:w="3402"/>
+          </w:tcPr>
+          <w:p>
+            <w:pPr>
+              <w:spacing w:after="20" w:before="20"/>
+            </w:pPr>
+            <w:r/>
+            <w:r>
+              <w:rPr>
+                <w:sz w:val="17"/>
+              </w:rPr>
+              <w:t>Signed account list; unofficial-channel warning; Google sign-in; member id checked on every action</w:t>
+            </w:r>
+          </w:p>
+        </w:tc>
+        <w:tc>
+          <w:tcPr>
+            <w:tcW w:type="dxa" w:w="2041"/>
+          </w:tcPr>
+          <w:p>
+            <w:pPr>
+              <w:spacing w:after="20" w:before="20"/>
+            </w:pPr>
+            <w:r/>
+            <w:r>
+              <w:rPr>
+                <w:sz w:val="17"/>
+              </w:rPr>
+              <w:t>A1, A6, A4 (made-up member)</w:t>
+            </w:r>
+          </w:p>
+        </w:tc>
+      </w:tr>
+      <w:tr>
+        <w:trPr>
+          <w:cantSplit/>
+        </w:trPr>
+        <w:tc>
+          <w:tcPr>
+            <w:tcW w:type="dxa" w:w="1587"/>
+            <w:shd w:val="clear" w:color="auto" w:fill="F3F7F9"/>
+          </w:tcPr>
+          <w:p>
+            <w:pPr>
+              <w:spacing w:after="20" w:before="20"/>
+            </w:pPr>
+            <w:r/>
+            <w:r>
+              <w:rPr>
+                <w:sz w:val="17"/>
+              </w:rPr>
+              <w:t>Tampering</w:t>
+            </w:r>
+          </w:p>
+        </w:tc>
+        <w:tc>
+          <w:tcPr>
+            <w:tcW w:type="dxa" w:w="2608"/>
+            <w:shd w:val="clear" w:color="auto" w:fill="F3F7F9"/>
+          </w:tcPr>
+          <w:p>
+            <w:pPr>
+              <w:spacing w:after="20" w:before="20"/>
+            </w:pPr>
+            <w:r/>
+            <w:r>
+              <w:rPr>
+                <w:sz w:val="17"/>
+              </w:rPr>
+              <w:t>Edited log row, forged invoice, changed account list</w:t>
+            </w:r>
+          </w:p>
+        </w:tc>
+        <w:tc>
+          <w:tcPr>
+            <w:tcW w:type="dxa" w:w="3402"/>
+            <w:shd w:val="clear" w:color="auto" w:fill="F3F7F9"/>
+          </w:tcPr>
+          <w:p>
+            <w:pPr>
+              <w:spacing w:after="20" w:before="20"/>
+            </w:pPr>
+            <w:r/>
+            <w:r>
+              <w:rPr>
+                <w:sz w:val="17"/>
+              </w:rPr>
+              <w:t>Hash-chained log; list signature; document hashes on the blockchain</w:t>
+            </w:r>
+          </w:p>
+        </w:tc>
+        <w:tc>
+          <w:tcPr>
+            <w:tcW w:type="dxa" w:w="2041"/>
+            <w:shd w:val="clear" w:color="auto" w:fill="F3F7F9"/>
+          </w:tcPr>
+          <w:p>
+            <w:pPr>
+              <w:spacing w:after="20" w:before="20"/>
+            </w:pPr>
+            <w:r/>
+            <w:r>
+              <w:rPr>
+                <w:sz w:val="17"/>
+              </w:rPr>
+              <w:t>A8, A9</w:t>
+            </w:r>
+          </w:p>
+        </w:tc>
+      </w:tr>
+      <w:tr>
+        <w:trPr>
+          <w:cantSplit/>
+        </w:trPr>
+        <w:tc>
+          <w:tcPr>
+            <w:tcW w:type="dxa" w:w="1587"/>
+          </w:tcPr>
+          <w:p>
+            <w:pPr>
+              <w:spacing w:after="20" w:before="20"/>
+            </w:pPr>
+            <w:r/>
+            <w:r>
+              <w:rPr>
+                <w:sz w:val="17"/>
+              </w:rPr>
+              <w:t>Repudiation</w:t>
+            </w:r>
+          </w:p>
+        </w:tc>
+        <w:tc>
+          <w:tcPr>
+            <w:tcW w:type="dxa" w:w="2608"/>
+          </w:tcPr>
+          <w:p>
+            <w:pPr>
+              <w:spacing w:after="20" w:before="20"/>
+            </w:pPr>
+            <w:r/>
+            <w:r>
+              <w:rPr>
+                <w:sz w:val="17"/>
+              </w:rPr>
+              <w:t>“I never approved that share”</w:t>
+            </w:r>
+          </w:p>
+        </w:tc>
+        <w:tc>
+          <w:tcPr>
+            <w:tcW w:type="dxa" w:w="3402"/>
+          </w:tcPr>
+          <w:p>
+            <w:pPr>
+              <w:spacing w:after="20" w:before="20"/>
+            </w:pPr>
+            <w:r/>
+            <w:r>
+              <w:rPr>
+                <w:sz w:val="17"/>
+              </w:rPr>
+              <w:t>Every approval, denial and charge logged with actor and time; one receipt per share</w:t>
+            </w:r>
+          </w:p>
+        </w:tc>
+        <w:tc>
+          <w:tcPr>
+            <w:tcW w:type="dxa" w:w="2041"/>
+          </w:tcPr>
+          <w:p>
+            <w:pPr>
+              <w:spacing w:after="20" w:before="20"/>
+            </w:pPr>
+            <w:r/>
+            <w:r>
+              <w:rPr>
+                <w:sz w:val="17"/>
+              </w:rPr>
+              <w:t>Sandbox log, A1–A9</w:t>
+            </w:r>
+          </w:p>
+        </w:tc>
+      </w:tr>
+      <w:tr>
+        <w:trPr>
+          <w:cantSplit/>
+        </w:trPr>
+        <w:tc>
+          <w:tcPr>
+            <w:tcW w:type="dxa" w:w="1587"/>
+            <w:shd w:val="clear" w:color="auto" w:fill="F3F7F9"/>
+          </w:tcPr>
+          <w:p>
+            <w:pPr>
+              <w:spacing w:after="20" w:before="20"/>
+            </w:pPr>
+            <w:r/>
+            <w:r>
+              <w:rPr>
+                <w:sz w:val="17"/>
+              </w:rPr>
+              <w:t>Information disclosure</w:t>
+            </w:r>
+          </w:p>
+        </w:tc>
+        <w:tc>
+          <w:tcPr>
+            <w:tcW w:type="dxa" w:w="2608"/>
+            <w:shd w:val="clear" w:color="auto" w:fill="F3F7F9"/>
+          </w:tcPr>
+          <w:p>
+            <w:pPr>
+              <w:spacing w:after="20" w:before="20"/>
+            </w:pPr>
+            <w:r/>
+            <w:r>
+              <w:rPr>
+                <w:sz w:val="17"/>
+              </w:rPr>
+              <w:t>Payer reads medical files; model sees names; data request in chat</w:t>
+            </w:r>
+          </w:p>
+        </w:tc>
+        <w:tc>
+          <w:tcPr>
+            <w:tcW w:type="dxa" w:w="3402"/>
+            <w:shd w:val="clear" w:color="auto" w:fill="F3F7F9"/>
+          </w:tcPr>
+          <w:p>
+            <w:pPr>
+              <w:spacing w:after="20" w:before="20"/>
+            </w:pPr>
+            <w:r/>
+            <w:r>
+              <w:rPr>
+                <w:sz w:val="17"/>
+              </w:rPr>
+              <w:t>Tokens before models; server-side role filtering; private storage; refusal in chat</w:t>
+            </w:r>
+          </w:p>
+        </w:tc>
+        <w:tc>
+          <w:tcPr>
+            <w:tcW w:type="dxa" w:w="2041"/>
+            <w:shd w:val="clear" w:color="auto" w:fill="F3F7F9"/>
+          </w:tcPr>
+          <w:p>
+            <w:pPr>
+              <w:spacing w:after="20" w:before="20"/>
+            </w:pPr>
+            <w:r/>
+            <w:r>
+              <w:rPr>
+                <w:sz w:val="17"/>
+              </w:rPr>
+              <w:t>A5, payer 403</w:t>
+            </w:r>
+          </w:p>
+        </w:tc>
+      </w:tr>
+      <w:tr>
+        <w:trPr>
+          <w:cantSplit/>
+        </w:trPr>
+        <w:tc>
+          <w:tcPr>
+            <w:tcW w:type="dxa" w:w="1587"/>
+          </w:tcPr>
+          <w:p>
+            <w:pPr>
+              <w:spacing w:after="20" w:before="20"/>
+            </w:pPr>
+            <w:r/>
+            <w:r>
+              <w:rPr>
+                <w:sz w:val="17"/>
+              </w:rPr>
+              <w:t>Denial of service</w:t>
+            </w:r>
+          </w:p>
+        </w:tc>
+        <w:tc>
+          <w:tcPr>
+            <w:tcW w:type="dxa" w:w="2608"/>
+          </w:tcPr>
+          <w:p>
+            <w:pPr>
+              <w:spacing w:after="20" w:before="20"/>
+            </w:pPr>
+            <w:r/>
+            <w:r>
+              <w:rPr>
+                <w:sz w:val="17"/>
+              </w:rPr>
+              <w:t>Burst of AI requests uses up the free quota</w:t>
+            </w:r>
+          </w:p>
+        </w:tc>
+        <w:tc>
+          <w:tcPr>
+            <w:tcW w:type="dxa" w:w="3402"/>
+          </w:tcPr>
+          <w:p>
+            <w:pPr>
+              <w:spacing w:after="20" w:before="20"/>
+            </w:pPr>
+            <w:r/>
+            <w:r>
+              <w:rPr>
+                <w:sz w:val="17"/>
+              </w:rPr>
+              <w:t>Rate limits per account and IP; time budgets; 10 MB files</w:t>
+            </w:r>
+          </w:p>
+        </w:tc>
+        <w:tc>
+          <w:tcPr>
+            <w:tcW w:type="dxa" w:w="2041"/>
+          </w:tcPr>
+          <w:p>
+            <w:pPr>
+              <w:spacing w:after="20" w:before="20"/>
+            </w:pPr>
+            <w:r/>
+            <w:r>
+              <w:rPr>
+                <w:sz w:val="17"/>
+              </w:rPr>
+              <w:t>Rate-limit test (12 of 20 burst calls → 429)</w:t>
+            </w:r>
+          </w:p>
+        </w:tc>
+      </w:tr>
+      <w:tr>
+        <w:trPr>
+          <w:cantSplit/>
+        </w:trPr>
+        <w:tc>
+          <w:tcPr>
+            <w:tcW w:type="dxa" w:w="1587"/>
+            <w:shd w:val="clear" w:color="auto" w:fill="F3F7F9"/>
+          </w:tcPr>
+          <w:p>
+            <w:pPr>
+              <w:spacing w:after="20" w:before="20"/>
+            </w:pPr>
+            <w:r/>
+            <w:r>
+              <w:rPr>
+                <w:sz w:val="17"/>
+              </w:rPr>
+              <w:t>Elevation of privilege</w:t>
+            </w:r>
+          </w:p>
+        </w:tc>
+        <w:tc>
+          <w:tcPr>
+            <w:tcW w:type="dxa" w:w="2608"/>
+            <w:shd w:val="clear" w:color="auto" w:fill="F3F7F9"/>
+          </w:tcPr>
+          <w:p>
+            <w:pPr>
+              <w:spacing w:after="20" w:before="20"/>
+            </w:pPr>
+            <w:r/>
+            <w:r>
+              <w:rPr>
+                <w:sz w:val="17"/>
+              </w:rPr>
+              <w:t>Companion or payer tries to approve, create or pay</w:t>
+            </w:r>
+          </w:p>
+        </w:tc>
+        <w:tc>
+          <w:tcPr>
+            <w:tcW w:type="dxa" w:w="3402"/>
+            <w:shd w:val="clear" w:color="auto" w:fill="F3F7F9"/>
+          </w:tcPr>
+          <w:p>
+            <w:pPr>
+              <w:spacing w:after="20" w:before="20"/>
+            </w:pPr>
+            <w:r/>
+            <w:r>
+              <w:rPr>
+                <w:sz w:val="17"/>
+              </w:rPr>
+              <w:t>Gateway check 3 and server role rules; no override</w:t>
+            </w:r>
+          </w:p>
+        </w:tc>
+        <w:tc>
+          <w:tcPr>
+            <w:tcW w:type="dxa" w:w="2041"/>
+            <w:shd w:val="clear" w:color="auto" w:fill="F3F7F9"/>
+          </w:tcPr>
+          <w:p>
+            <w:pPr>
+              <w:spacing w:after="20" w:before="20"/>
+            </w:pPr>
+            <w:r/>
+            <w:r>
+              <w:rPr>
+                <w:sz w:val="17"/>
+              </w:rPr>
+              <w:t>A4, A7</w:t>
+            </w:r>
+          </w:p>
+        </w:tc>
+      </w:tr>
+    </w:tbl>
+    <w:p>
+      <w:pPr>
+        <w:spacing w:after="40"/>
+      </w:pPr>
+    </w:p>
+    <w:p>
+      <w:pPr>
+        <w:pStyle w:val="Heading2"/>
+      </w:pPr>
+      <w:r>
+        <w:t>OWASP Top 10 for LLM Applications (2025)</w:t>
+      </w:r>
+    </w:p>
+    <w:tbl>
+      <w:tblPr>
+        <w:tblW w:type="dxa" w:w="9639"/>
+        <w:jc w:val="center"/>
+        <w:tblLayout w:type="fixed"/>
+        <w:tblLook w:firstColumn="1" w:firstRow="1" w:lastColumn="0" w:lastRow="0" w:noHBand="0" w:noVBand="1" w:val="04A0"/>
+        <w:tblBorders>
+          <w:top w:val="single" w:sz="4" w:color="C9D5DC"/>
+          <w:left w:val="single" w:sz="4" w:color="C9D5DC"/>
+          <w:bottom w:val="single" w:sz="4" w:color="C9D5DC"/>
+          <w:right w:val="single" w:sz="4" w:color="C9D5DC"/>
+          <w:insideH w:val="single" w:sz="4" w:color="C9D5DC"/>
+          <w:insideV w:val="single" w:sz="4" w:color="C9D5DC"/>
+        </w:tblBorders>
+        <w:tblLayout w:type="fixed"/>
+      </w:tblPr>
+      <w:tblGrid>
+        <w:gridCol w:w="2721"/>
+        <w:gridCol w:w="4876"/>
+        <w:gridCol w:w="2041"/>
+      </w:tblGrid>
+      <w:tr>
+        <w:trPr>
+          <w:cantSplit/>
+          <w:tblHeader w:val="true"/>
+        </w:trPr>
+        <w:tc>
+          <w:tcPr>
+            <w:tcW w:type="dxa" w:w="2721"/>
+            <w:shd w:val="clear" w:color="auto" w:fill="DAE7EE"/>
+          </w:tcPr>
+          <w:p>
+            <w:pPr>
+              <w:spacing w:after="20" w:before="20"/>
+            </w:pPr>
+            <w:r/>
+            <w:r>
+              <w:rPr>
+                <w:b/>
+                <w:color w:val="375D84"/>
+                <w:sz w:val="17"/>
+              </w:rPr>
+              <w:t>Risk</w:t>
+            </w:r>
+          </w:p>
+        </w:tc>
+        <w:tc>
+          <w:tcPr>
+            <w:tcW w:type="dxa" w:w="4876"/>
+            <w:shd w:val="clear" w:color="auto" w:fill="DAE7EE"/>
+          </w:tcPr>
+          <w:p>
+            <w:pPr>
+              <w:spacing w:after="20" w:before="20"/>
+            </w:pPr>
+            <w:r/>
+            <w:r>
+              <w:rPr>
+                <w:b/>
+                <w:color w:val="375D84"/>
+                <w:sz w:val="17"/>
+              </w:rPr>
+              <w:t>How Guardian handles it</w:t>
+            </w:r>
+          </w:p>
+        </w:tc>
+        <w:tc>
+          <w:tcPr>
+            <w:tcW w:type="dxa" w:w="2041"/>
+            <w:shd w:val="clear" w:color="auto" w:fill="DAE7EE"/>
+          </w:tcPr>
+          <w:p>
+            <w:pPr>
+              <w:spacing w:after="20" w:before="20"/>
+            </w:pPr>
+            <w:r/>
+            <w:r>
+              <w:rPr>
+                <w:b/>
+                <w:color w:val="375D84"/>
+                <w:sz w:val="17"/>
+              </w:rPr>
+              <w:t>Status</w:t>
+            </w:r>
+          </w:p>
+        </w:tc>
+      </w:tr>
+      <w:tr>
+        <w:trPr>
+          <w:cantSplit/>
+        </w:trPr>
+        <w:tc>
+          <w:tcPr>
+            <w:tcW w:type="dxa" w:w="2721"/>
+          </w:tcPr>
+          <w:p>
+            <w:pPr>
+              <w:spacing w:after="20" w:before="20"/>
+            </w:pPr>
+            <w:r/>
+            <w:r>
+              <w:rPr>
+                <w:sz w:val="17"/>
+              </w:rPr>
+              <w:t>LLM01 Prompt injection</w:t>
+            </w:r>
+          </w:p>
+        </w:tc>
+        <w:tc>
+          <w:tcPr>
+            <w:tcW w:type="dxa" w:w="4876"/>
+          </w:tcPr>
+          <w:p>
+            <w:pPr>
+              <w:spacing w:after="20" w:before="20"/>
+            </w:pPr>
+            <w:r/>
+            <w:r>
+              <w:rPr>
+                <w:sz w:val="17"/>
+              </w:rPr>
+              <w:t>Reader has no tools and a fixed schema; instructions in documents become warnings</w:t>
+            </w:r>
+          </w:p>
+        </w:tc>
+        <w:tc>
+          <w:tcPr>
+            <w:tcW w:type="dxa" w:w="2041"/>
+          </w:tcPr>
+          <w:p>
+            <w:pPr>
+              <w:spacing w:after="20" w:before="20"/>
+            </w:pPr>
+            <w:r/>
+            <w:r>
+              <w:rPr>
+                <w:sz w:val="17"/>
+              </w:rPr>
+              <w:t>Covered (A2)</w:t>
+            </w:r>
+          </w:p>
+        </w:tc>
+      </w:tr>
+      <w:tr>
+        <w:trPr>
+          <w:cantSplit/>
+        </w:trPr>
+        <w:tc>
+          <w:tcPr>
+            <w:tcW w:type="dxa" w:w="2721"/>
+            <w:shd w:val="clear" w:color="auto" w:fill="F3F7F9"/>
+          </w:tcPr>
+          <w:p>
+            <w:pPr>
+              <w:spacing w:after="20" w:before="20"/>
+            </w:pPr>
+            <w:r/>
+            <w:r>
+              <w:rPr>
+                <w:sz w:val="17"/>
+              </w:rPr>
+              <w:t>LLM02 Sensitive information disclosure</w:t>
+            </w:r>
+          </w:p>
+        </w:tc>
+        <w:tc>
+          <w:tcPr>
+            <w:tcW w:type="dxa" w:w="4876"/>
+            <w:shd w:val="clear" w:color="auto" w:fill="F3F7F9"/>
+          </w:tcPr>
+          <w:p>
+            <w:pPr>
+              <w:spacing w:after="20" w:before="20"/>
+            </w:pPr>
+            <w:r/>
+            <w:r>
+              <w:rPr>
+                <w:sz w:val="17"/>
+              </w:rPr>
+              <w:t>Tokens before every model call; role filtering on the server</w:t>
+            </w:r>
+          </w:p>
+        </w:tc>
+        <w:tc>
+          <w:tcPr>
+            <w:tcW w:type="dxa" w:w="2041"/>
+            <w:shd w:val="clear" w:color="auto" w:fill="F3F7F9"/>
+          </w:tcPr>
+          <w:p>
+            <w:pPr>
+              <w:spacing w:after="20" w:before="20"/>
+            </w:pPr>
+            <w:r/>
+            <w:r>
+              <w:rPr>
+                <w:sz w:val="17"/>
+              </w:rPr>
+              <w:t>Covered (A5)</w:t>
+            </w:r>
+          </w:p>
+        </w:tc>
+      </w:tr>
+      <w:tr>
+        <w:trPr>
+          <w:cantSplit/>
+        </w:trPr>
+        <w:tc>
+          <w:tcPr>
+            <w:tcW w:type="dxa" w:w="2721"/>
+          </w:tcPr>
+          <w:p>
+            <w:pPr>
+              <w:spacing w:after="20" w:before="20"/>
+            </w:pPr>
+            <w:r/>
+            <w:r>
+              <w:rPr>
+                <w:sz w:val="17"/>
+              </w:rPr>
+              <w:t>LLM03 Supply chain</w:t>
+            </w:r>
+          </w:p>
+        </w:tc>
+        <w:tc>
+          <w:tcPr>
+            <w:tcW w:type="dxa" w:w="4876"/>
+          </w:tcPr>
+          <w:p>
+            <w:pPr>
+              <w:spacing w:after="20" w:before="20"/>
+            </w:pPr>
+            <w:r/>
+            <w:r>
+              <w:rPr>
+                <w:sz w:val="17"/>
+              </w:rPr>
+              <w:t>Lockfile fixes every package version (npm ci); models only from known providers</w:t>
+            </w:r>
+          </w:p>
+        </w:tc>
+        <w:tc>
+          <w:tcPr>
+            <w:tcW w:type="dxa" w:w="2041"/>
+          </w:tcPr>
+          <w:p>
+            <w:pPr>
+              <w:spacing w:after="20" w:before="20"/>
+            </w:pPr>
+            <w:r/>
+            <w:r>
+              <w:rPr>
+                <w:sz w:val="17"/>
+              </w:rPr>
+              <w:t>Partly: some dependency audit warnings remain open</w:t>
+            </w:r>
+          </w:p>
+        </w:tc>
+      </w:tr>
+      <w:tr>
+        <w:trPr>
+          <w:cantSplit/>
+        </w:trPr>
+        <w:tc>
+          <w:tcPr>
+            <w:tcW w:type="dxa" w:w="2721"/>
+            <w:shd w:val="clear" w:color="auto" w:fill="F3F7F9"/>
+          </w:tcPr>
+          <w:p>
+            <w:pPr>
+              <w:spacing w:after="20" w:before="20"/>
+            </w:pPr>
+            <w:r/>
+            <w:r>
+              <w:rPr>
+                <w:sz w:val="17"/>
+              </w:rPr>
+              <w:t>LLM04 Data and model poisoning</w:t>
+            </w:r>
+          </w:p>
+        </w:tc>
+        <w:tc>
+          <w:tcPr>
+            <w:tcW w:type="dxa" w:w="4876"/>
+            <w:shd w:val="clear" w:color="auto" w:fill="F3F7F9"/>
+          </w:tcPr>
+          <w:p>
+            <w:pPr>
+              <w:spacing w:after="20" w:before="20"/>
+            </w:pPr>
+            <w:r/>
+            <w:r>
+              <w:rPr>
+                <w:sz w:val="17"/>
+              </w:rPr>
+              <w:t>No training or fine-tuning; answer keys written by hand</w:t>
+            </w:r>
+          </w:p>
+        </w:tc>
+        <w:tc>
+          <w:tcPr>
+            <w:tcW w:type="dxa" w:w="2041"/>
+            <w:shd w:val="clear" w:color="auto" w:fill="F3F7F9"/>
+          </w:tcPr>
+          <w:p>
+            <w:pPr>
+              <w:spacing w:after="20" w:before="20"/>
+            </w:pPr>
+            <w:r/>
+            <w:r>
+              <w:rPr>
+                <w:sz w:val="17"/>
+              </w:rPr>
+              <w:t>Not applicable</w:t>
+            </w:r>
+          </w:p>
+        </w:tc>
+      </w:tr>
+      <w:tr>
+        <w:trPr>
+          <w:cantSplit/>
+        </w:trPr>
+        <w:tc>
+          <w:tcPr>
+            <w:tcW w:type="dxa" w:w="2721"/>
+          </w:tcPr>
+          <w:p>
+            <w:pPr>
+              <w:spacing w:after="20" w:before="20"/>
+            </w:pPr>
+            <w:r/>
+            <w:r>
+              <w:rPr>
+                <w:sz w:val="17"/>
+              </w:rPr>
+              <w:t>LLM05 Improper output handling</w:t>
+            </w:r>
+          </w:p>
+        </w:tc>
+        <w:tc>
+          <w:tcPr>
+            <w:tcW w:type="dxa" w:w="4876"/>
+          </w:tcPr>
+          <w:p>
+            <w:pPr>
+              <w:spacing w:after="20" w:before="20"/>
+            </w:pPr>
+            <w:r/>
+            <w:r>
+              <w:rPr>
+                <w:sz w:val="17"/>
+              </w:rPr>
+              <w:t>Model output parsed by a zod schema; displayed facts rebuilt from code</w:t>
+            </w:r>
+          </w:p>
+        </w:tc>
+        <w:tc>
+          <w:tcPr>
+            <w:tcW w:type="dxa" w:w="2041"/>
+          </w:tcPr>
+          <w:p>
+            <w:pPr>
+              <w:spacing w:after="20" w:before="20"/>
+            </w:pPr>
+            <w:r/>
+            <w:r>
+              <w:rPr>
+                <w:sz w:val="17"/>
+              </w:rPr>
+              <w:t>Covered</w:t>
+            </w:r>
+          </w:p>
+        </w:tc>
+      </w:tr>
+      <w:tr>
+        <w:trPr>
+          <w:cantSplit/>
+        </w:trPr>
+        <w:tc>
+          <w:tcPr>
+            <w:tcW w:type="dxa" w:w="2721"/>
+            <w:shd w:val="clear" w:color="auto" w:fill="F3F7F9"/>
+          </w:tcPr>
+          <w:p>
+            <w:pPr>
+              <w:spacing w:after="20" w:before="20"/>
+            </w:pPr>
+            <w:r/>
+            <w:r>
+              <w:rPr>
+                <w:sz w:val="17"/>
+              </w:rPr>
+              <w:t>LLM06 Excessive agency</w:t>
+            </w:r>
+          </w:p>
+        </w:tc>
+        <w:tc>
+          <w:tcPr>
+            <w:tcW w:type="dxa" w:w="4876"/>
+            <w:shd w:val="clear" w:color="auto" w:fill="F3F7F9"/>
+          </w:tcPr>
+          <w:p>
+            <w:pPr>
+              <w:spacing w:after="20" w:before="20"/>
+            </w:pPr>
+            <w:r/>
+            <w:r>
+              <w:rPr>
+                <w:sz w:val="17"/>
+              </w:rPr>
+              <w:t>Models cannot create, pledge or pay; the planner only prepares</w:t>
+            </w:r>
+          </w:p>
+        </w:tc>
+        <w:tc>
+          <w:tcPr>
+            <w:tcW w:type="dxa" w:w="2041"/>
+            <w:shd w:val="clear" w:color="auto" w:fill="F3F7F9"/>
+          </w:tcPr>
+          <w:p>
+            <w:pPr>
+              <w:spacing w:after="20" w:before="20"/>
+            </w:pPr>
+            <w:r/>
+            <w:r>
+              <w:rPr>
+                <w:sz w:val="17"/>
+              </w:rPr>
+              <w:t>Covered (A7)</w:t>
+            </w:r>
+          </w:p>
+        </w:tc>
+      </w:tr>
+      <w:tr>
+        <w:trPr>
+          <w:cantSplit/>
+        </w:trPr>
+        <w:tc>
+          <w:tcPr>
+            <w:tcW w:type="dxa" w:w="2721"/>
+          </w:tcPr>
+          <w:p>
+            <w:pPr>
+              <w:spacing w:after="20" w:before="20"/>
+            </w:pPr>
+            <w:r/>
+            <w:r>
+              <w:rPr>
+                <w:sz w:val="17"/>
+              </w:rPr>
+              <w:t>LLM07 System prompt leakage</w:t>
+            </w:r>
+          </w:p>
+        </w:tc>
+        <w:tc>
+          <w:tcPr>
+            <w:tcW w:type="dxa" w:w="4876"/>
+          </w:tcPr>
+          <w:p>
+            <w:pPr>
+              <w:spacing w:after="20" w:before="20"/>
+            </w:pPr>
+            <w:r/>
+            <w:r>
+              <w:rPr>
+                <w:sz w:val="17"/>
+              </w:rPr>
+              <w:t>Prompts hold no secrets or keys</w:t>
+            </w:r>
+          </w:p>
+        </w:tc>
+        <w:tc>
+          <w:tcPr>
+            <w:tcW w:type="dxa" w:w="2041"/>
+          </w:tcPr>
+          <w:p>
+            <w:pPr>
+              <w:spacing w:after="20" w:before="20"/>
+            </w:pPr>
+            <w:r/>
+            <w:r>
+              <w:rPr>
+                <w:sz w:val="17"/>
+              </w:rPr>
+              <w:t>Covered by design</w:t>
+            </w:r>
+          </w:p>
+        </w:tc>
+      </w:tr>
+      <w:tr>
+        <w:trPr>
+          <w:cantSplit/>
+        </w:trPr>
+        <w:tc>
+          <w:tcPr>
+            <w:tcW w:type="dxa" w:w="2721"/>
+            <w:shd w:val="clear" w:color="auto" w:fill="F3F7F9"/>
+          </w:tcPr>
+          <w:p>
+            <w:pPr>
+              <w:spacing w:after="20" w:before="20"/>
+            </w:pPr>
+            <w:r/>
+            <w:r>
+              <w:rPr>
+                <w:sz w:val="17"/>
+              </w:rPr>
+              <w:t>LLM08 Vector and embedding weaknesses</w:t>
+            </w:r>
+          </w:p>
+        </w:tc>
+        <w:tc>
+          <w:tcPr>
+            <w:tcW w:type="dxa" w:w="4876"/>
+            <w:shd w:val="clear" w:color="auto" w:fill="F3F7F9"/>
+          </w:tcPr>
+          <w:p>
+            <w:pPr>
+              <w:spacing w:after="20" w:before="20"/>
+            </w:pPr>
+            <w:r/>
+            <w:r>
+              <w:rPr>
+                <w:sz w:val="17"/>
+              </w:rPr>
+              <w:t>No vector store or retrieval</w:t>
+            </w:r>
+          </w:p>
+        </w:tc>
+        <w:tc>
+          <w:tcPr>
+            <w:tcW w:type="dxa" w:w="2041"/>
+            <w:shd w:val="clear" w:color="auto" w:fill="F3F7F9"/>
+          </w:tcPr>
+          <w:p>
+            <w:pPr>
+              <w:spacing w:after="20" w:before="20"/>
+            </w:pPr>
+            <w:r/>
+            <w:r>
+              <w:rPr>
+                <w:sz w:val="17"/>
+              </w:rPr>
+              <w:t>Not applicable</w:t>
+            </w:r>
+          </w:p>
+        </w:tc>
+      </w:tr>
+      <w:tr>
+        <w:trPr>
+          <w:cantSplit/>
+        </w:trPr>
+        <w:tc>
+          <w:tcPr>
+            <w:tcW w:type="dxa" w:w="2721"/>
+          </w:tcPr>
+          <w:p>
+            <w:pPr>
+              <w:spacing w:after="20" w:before="20"/>
+            </w:pPr>
+            <w:r/>
+            <w:r>
+              <w:rPr>
+                <w:sz w:val="17"/>
+              </w:rPr>
+              <w:t>LLM09 Misinformation</w:t>
+            </w:r>
+          </w:p>
+        </w:tc>
+        <w:tc>
+          <w:tcPr>
+            <w:tcW w:type="dxa" w:w="4876"/>
+          </w:tcPr>
+          <w:p>
+            <w:pPr>
+              <w:spacing w:after="20" w:before="20"/>
+            </w:pPr>
+            <w:r/>
+            <w:r>
+              <w:rPr>
+                <w:sz w:val="17"/>
+              </w:rPr>
+              <w:t>Numbers from code; cited lines only; no invented clinical causes; second model on demand</w:t>
+            </w:r>
+          </w:p>
+        </w:tc>
+        <w:tc>
+          <w:tcPr>
+            <w:tcW w:type="dxa" w:w="2041"/>
+          </w:tcPr>
+          <w:p>
+            <w:pPr>
+              <w:spacing w:after="20" w:before="20"/>
+            </w:pPr>
+            <w:r/>
+            <w:r>
+              <w:rPr>
+                <w:sz w:val="17"/>
+              </w:rPr>
+              <w:t>Covered (baseline: 0 invented causes)</w:t>
+            </w:r>
+          </w:p>
+        </w:tc>
+      </w:tr>
+      <w:tr>
+        <w:trPr>
+          <w:cantSplit/>
+        </w:trPr>
+        <w:tc>
+          <w:tcPr>
+            <w:tcW w:type="dxa" w:w="2721"/>
+            <w:shd w:val="clear" w:color="auto" w:fill="F3F7F9"/>
+          </w:tcPr>
+          <w:p>
+            <w:pPr>
+              <w:spacing w:after="20" w:before="20"/>
+            </w:pPr>
+            <w:r/>
+            <w:r>
+              <w:rPr>
+                <w:sz w:val="17"/>
+              </w:rPr>
+              <w:t>LLM10 Unbounded consumption</w:t>
+            </w:r>
+          </w:p>
+        </w:tc>
+        <w:tc>
+          <w:tcPr>
+            <w:tcW w:type="dxa" w:w="4876"/>
+            <w:shd w:val="clear" w:color="auto" w:fill="F3F7F9"/>
+          </w:tcPr>
+          <w:p>
+            <w:pPr>
+              <w:spacing w:after="20" w:before="20"/>
+            </w:pPr>
+            <w:r/>
+            <w:r>
+              <w:rPr>
+                <w:sz w:val="17"/>
+              </w:rPr>
+              <w:t>Rate limits, time budgets, response cache</w:t>
+            </w:r>
+          </w:p>
+        </w:tc>
+        <w:tc>
+          <w:tcPr>
+            <w:tcW w:type="dxa" w:w="2041"/>
+            <w:shd w:val="clear" w:color="auto" w:fill="F3F7F9"/>
+          </w:tcPr>
+          <w:p>
+            <w:pPr>
+              <w:spacing w:after="20" w:before="20"/>
+            </w:pPr>
+            <w:r/>
+            <w:r>
+              <w:rPr>
+                <w:sz w:val="17"/>
+              </w:rPr>
+              <w:t>Covered</w:t>
+            </w:r>
+          </w:p>
+        </w:tc>
+      </w:tr>
+    </w:tbl>
+    <w:p>
+      <w:pPr>
+        <w:spacing w:after="40"/>
+      </w:pPr>
     </w:p>
     <w:p>
       <w:pPr>

</xml_diff>

<commit_message>
Remove demo account sign-in and mentions
Co-Authored-By: Claude Opus 5.5 <noreply@anthropic.com>
Claude-Session: https://claude.ai/code/session_01JDvam517Atc93dpXbZEF5b
</commit_message>
<xml_diff>
--- a/docs/technical-doc/AI-Guardian-TechnicalDocumentation.docx
+++ b/docs/technical-doc/AI-Guardian-TechnicalDocumentation.docx
@@ -165,7 +165,7 @@
               <w:rPr>
                 <w:sz w:val="20"/>
               </w:rPr>
-              <w:t>https://guardian.scientivan.dev  (choose “Use demo account”)</w:t>
+              <w:t>https://guardian.scientivan.dev  (sign in with Google)</w:t>
             </w:r>
           </w:p>
         </w:tc>
@@ -4915,7 +4915,7 @@
               <w:rPr>
                 <w:sz w:val="19"/>
               </w:rPr>
-              <w:t>NextAuth: Google OAuth (8-hour session) and a separate demo account</w:t>
+              <w:t>NextAuth: Google OAuth (8-hour session)</w:t>
             </w:r>
           </w:p>
         </w:tc>
@@ -7779,7 +7779,7 @@
       </w:pPr>
       <w:r>
         <w:rPr/>
-        <w:t>A user turn is a click, typed value or file the person must give. An agent turn is a response the product shows. Measured with a browser script on a fresh demo account (evidence/interaction-2026-10-20).</w:t>
+        <w:t>A user turn is a click, typed value or file the person must give. An agent turn is a response the product shows. Measured with a browser script on a fresh seeded test workspace (evidence/interaction-2026-10-20).</w:t>
       </w:r>
     </w:p>
     <w:tbl>
@@ -16811,7 +16811,7 @@
               <w:rPr>
                 <w:sz w:val="19"/>
               </w:rPr>
-              <w:t>Open https://guardian.scientivan.dev → Use demo account → Bill Review → Pledges (use “Viewing as” to act as a payer) → Case History</w:t>
+              <w:t>Open https://guardian.scientivan.dev → Sign in with Google → Bill Review → Case Members (invite a payer by Google email) → Pledges → Case History</w:t>
             </w:r>
           </w:p>
         </w:tc>
@@ -17721,7 +17721,7 @@
               <w:rPr>
                 <w:sz w:val="19"/>
               </w:rPr>
-              <w:t>Google OAuth and the demo account</w:t>
+              <w:t>Google OAuth</w:t>
             </w:r>
           </w:p>
         </w:tc>

</xml_diff>